<commit_message>
Add American IPA, parts of speech and English definitions
</commit_message>
<xml_diff>
--- a/downloads/season-01-study-guide.docx
+++ b/downloads/season-01-study-guide.docx
@@ -12,7 +12,12 @@
     </w:p>
     <w:p>
       <w:r>
-        <w:t>V2 · 每集不超过 15 项关键词与词组；每项 3 个原创双语例句。英文梗概不超过 200 词，含剧透。</w:t>
+        <w:t>V3 · 每集不超过 15 项关键词与词组；关键词含美式 IPA，所有词条含词性与英文释义；每项 3 个原创双语例句。英文梗概不超过 200 词，含剧透。</w:t>
+      </w:r>
+    </w:p>
+    <w:p>
+      <w:r>
+        <w:t>关键词采用常见美式读法的宽式 IPA；/ɝ/、/ɚ/ 表示带 r 色彩的元音，/i/、/u/ 不另加长音符号。音标对应显示的词条形式。词性列出本页讲解的用法；部分词有其他读法或词性。</w:t>
       </w:r>
     </w:p>
     <w:p>
@@ -56,6 +61,21 @@
     </w:p>
     <w:p>
       <w:r>
+        <w:t>美式 IPA：/ɪmˈbɛzəlmənt/</w:t>
+      </w:r>
+    </w:p>
+    <w:p>
+      <w:r>
+        <w:t>词性：noun</w:t>
+      </w:r>
+    </w:p>
+    <w:p>
+      <w:r>
+        <w:t>English definition: The dishonest taking of money or property entrusted to one's care.</w:t>
+      </w:r>
+    </w:p>
+    <w:p>
+      <w:r>
         <w:t>侵占；挪用受托管理的财产</w:t>
       </w:r>
     </w:p>
@@ -100,6 +120,21 @@
     </w:p>
     <w:p>
       <w:r>
+        <w:t>美式 IPA：/ˈfɛləni/</w:t>
+      </w:r>
+    </w:p>
+    <w:p>
+      <w:r>
+        <w:t>词性：noun</w:t>
+      </w:r>
+    </w:p>
+    <w:p>
+      <w:r>
+        <w:t>English definition: A serious category of crime, generally carrying more severe penalties than a misdemeanor.</w:t>
+      </w:r>
+    </w:p>
+    <w:p>
+      <w:r>
         <w:t>重罪</w:t>
       </w:r>
     </w:p>
@@ -144,6 +179,21 @@
     </w:p>
     <w:p>
       <w:r>
+        <w:t>美式 IPA：/dɪˈfɛndənt/</w:t>
+      </w:r>
+    </w:p>
+    <w:p>
+      <w:r>
+        <w:t>词性：noun</w:t>
+      </w:r>
+    </w:p>
+    <w:p>
+      <w:r>
+        <w:t>English definition: The person or organization against whom a criminal charge or civil claim is brought.</w:t>
+      </w:r>
+    </w:p>
+    <w:p>
+      <w:r>
         <w:t>被告</w:t>
       </w:r>
     </w:p>
@@ -188,6 +238,21 @@
     </w:p>
     <w:p>
       <w:r>
+        <w:t>美式 IPA：/ˌprɑsəˈkjuʃən/</w:t>
+      </w:r>
+    </w:p>
+    <w:p>
+      <w:r>
+        <w:t>词性：noun</w:t>
+      </w:r>
+    </w:p>
+    <w:p>
+      <w:r>
+        <w:t>English definition: The pursuit of criminal charges in court; also the lawyers bringing those charges.</w:t>
+      </w:r>
+    </w:p>
+    <w:p>
+      <w:r>
         <w:t>控方；起诉；检控</w:t>
       </w:r>
     </w:p>
@@ -232,6 +297,26 @@
     </w:p>
     <w:p>
       <w:r>
+        <w:t>美式 IPA：/ˈtrɛsˌpæsɪŋ/</w:t>
+      </w:r>
+    </w:p>
+    <w:p>
+      <w:r>
+        <w:t>词性：noun / verb (-ing form)</w:t>
+      </w:r>
+    </w:p>
+    <w:p>
+      <w:r>
+        <w:t>English definition: Entering or remaining on another person's property without permission; the -ing form of trespass.</w:t>
+      </w:r>
+    </w:p>
+    <w:p>
+      <w:r>
+        <w:t>原形：trespass</w:t>
+      </w:r>
+    </w:p>
+    <w:p>
+      <w:r>
         <w:t>擅自进入或逗留他人土地、场所</w:t>
       </w:r>
     </w:p>
@@ -276,6 +361,21 @@
     </w:p>
     <w:p>
       <w:r>
+        <w:t>美式 IPA：/əˈreɪnmənt/</w:t>
+      </w:r>
+    </w:p>
+    <w:p>
+      <w:r>
+        <w:t>词性：noun</w:t>
+      </w:r>
+    </w:p>
+    <w:p>
+      <w:r>
+        <w:t>English definition: A court appearance at which charges are stated and the defendant enters a plea.</w:t>
+      </w:r>
+    </w:p>
+    <w:p>
+      <w:r>
         <w:t>正式提审并要求被告答辩的程序</w:t>
       </w:r>
     </w:p>
@@ -320,6 +420,21 @@
     </w:p>
     <w:p>
       <w:r>
+        <w:t>美式 IPA：/dɪˈskrɛpənsi/</w:t>
+      </w:r>
+    </w:p>
+    <w:p>
+      <w:r>
+        <w:t>词性：noun</w:t>
+      </w:r>
+    </w:p>
+    <w:p>
+      <w:r>
+        <w:t>English definition: A difference between things that should agree or match.</w:t>
+      </w:r>
+    </w:p>
+    <w:p>
+      <w:r>
         <w:t>不一致；差异</w:t>
       </w:r>
     </w:p>
@@ -364,6 +479,21 @@
     </w:p>
     <w:p>
       <w:r>
+        <w:t>美式 IPA：/ˌædvɚˈsɛriəl/</w:t>
+      </w:r>
+    </w:p>
+    <w:p>
+      <w:r>
+        <w:t>词性：adjective</w:t>
+      </w:r>
+    </w:p>
+    <w:p>
+      <w:r>
+        <w:t>English definition: Involving opposing sides that challenge each other's claims.</w:t>
+      </w:r>
+    </w:p>
+    <w:p>
+      <w:r>
         <w:t>对抗性的；双方交锋的</w:t>
       </w:r>
     </w:p>
@@ -408,6 +538,16 @@
     </w:p>
     <w:p>
       <w:r>
+        <w:t>词性：adverb phrase</w:t>
+      </w:r>
+    </w:p>
+    <w:p>
+      <w:r>
+        <w:t>English definition: Paid using a person's own money rather than reimbursed or covered by someone else.</w:t>
+      </w:r>
+    </w:p>
+    <w:p>
+      <w:r>
         <w:t>自掏腰包；蒙受钱财损失</w:t>
       </w:r>
     </w:p>
@@ -531,6 +671,21 @@
     </w:p>
     <w:p>
       <w:r>
+        <w:t>美式 IPA：/ɪmˈbɛzəlmənt/</w:t>
+      </w:r>
+    </w:p>
+    <w:p>
+      <w:r>
+        <w:t>词性：noun</w:t>
+      </w:r>
+    </w:p>
+    <w:p>
+      <w:r>
+        <w:t>English definition: The dishonest taking of money or property entrusted to one's care.</w:t>
+      </w:r>
+    </w:p>
+    <w:p>
+      <w:r>
         <w:t>侵占；挪用受托管理的财产</w:t>
       </w:r>
     </w:p>
@@ -575,6 +730,21 @@
     </w:p>
     <w:p>
       <w:r>
+        <w:t>美式 IPA：/ˌmɪsdəˈminɚ/</w:t>
+      </w:r>
+    </w:p>
+    <w:p>
+      <w:r>
+        <w:t>词性：noun</w:t>
+      </w:r>
+    </w:p>
+    <w:p>
+      <w:r>
+        <w:t>English definition: A criminal offense in a less serious category than a felony.</w:t>
+      </w:r>
+    </w:p>
+    <w:p>
+      <w:r>
         <w:t>轻罪</w:t>
       </w:r>
     </w:p>
@@ -619,6 +789,21 @@
     </w:p>
     <w:p>
       <w:r>
+        <w:t>美式 IPA：/ˈfɛləni/</w:t>
+      </w:r>
+    </w:p>
+    <w:p>
+      <w:r>
+        <w:t>词性：noun</w:t>
+      </w:r>
+    </w:p>
+    <w:p>
+      <w:r>
+        <w:t>English definition: A serious category of crime, generally carrying more severe penalties than a misdemeanor.</w:t>
+      </w:r>
+    </w:p>
+    <w:p>
+      <w:r>
         <w:t>重罪</w:t>
       </w:r>
     </w:p>
@@ -663,6 +848,21 @@
     </w:p>
     <w:p>
       <w:r>
+        <w:t>美式 IPA：/proʊˈbeɪʃən/</w:t>
+      </w:r>
+    </w:p>
+    <w:p>
+      <w:r>
+        <w:t>词性：noun</w:t>
+      </w:r>
+    </w:p>
+    <w:p>
+      <w:r>
+        <w:t>English definition: Court-ordered community supervision under conditions; also a trial period for a new employee.</w:t>
+      </w:r>
+    </w:p>
+    <w:p>
+      <w:r>
         <w:t>缓刑或社区监督；试用期</w:t>
       </w:r>
     </w:p>
@@ -707,6 +907,21 @@
     </w:p>
     <w:p>
       <w:r>
+        <w:t>美式 IPA：/ˈprɪvəlɪdʒ/</w:t>
+      </w:r>
+    </w:p>
+    <w:p>
+      <w:r>
+        <w:t>词性：noun</w:t>
+      </w:r>
+    </w:p>
+    <w:p>
+      <w:r>
+        <w:t>English definition: A special right or advantage; in law, a protection that can prevent compelled disclosure of certain communications.</w:t>
+      </w:r>
+    </w:p>
+    <w:p>
+      <w:r>
         <w:t>法律保密特权；特殊权利或荣幸</w:t>
       </w:r>
     </w:p>
@@ -751,6 +966,26 @@
     </w:p>
     <w:p>
       <w:r>
+        <w:t>美式 IPA：/ˈbækˌslaɪdɪŋ/</w:t>
+      </w:r>
+    </w:p>
+    <w:p>
+      <w:r>
+        <w:t>词性：noun</w:t>
+      </w:r>
+    </w:p>
+    <w:p>
+      <w:r>
+        <w:t>English definition: A return to harmful habits after a period of improvement.</w:t>
+      </w:r>
+    </w:p>
+    <w:p>
+      <w:r>
+        <w:t>原形：backslide</w:t>
+      </w:r>
+    </w:p>
+    <w:p>
+      <w:r>
         <w:t>故态复萌；退步</w:t>
       </w:r>
     </w:p>
@@ -869,6 +1104,21 @@
     </w:p>
     <w:p>
       <w:r>
+        <w:t>美式 IPA：/dɪˈfɛndənt/</w:t>
+      </w:r>
+    </w:p>
+    <w:p>
+      <w:r>
+        <w:t>词性：noun</w:t>
+      </w:r>
+    </w:p>
+    <w:p>
+      <w:r>
+        <w:t>English definition: The person or organization against whom a criminal charge or civil claim is brought.</w:t>
+      </w:r>
+    </w:p>
+    <w:p>
+      <w:r>
         <w:t>被告</w:t>
       </w:r>
     </w:p>
@@ -913,6 +1163,21 @@
     </w:p>
     <w:p>
       <w:r>
+        <w:t>美式 IPA：/əˈsɔlt/</w:t>
+      </w:r>
+    </w:p>
+    <w:p>
+      <w:r>
+        <w:t>词性：noun / verb</w:t>
+      </w:r>
+    </w:p>
+    <w:p>
+      <w:r>
+        <w:t>English definition: A physical attack or, in some legal uses, conduct that creates fear of imminent harm; to attack.</w:t>
+      </w:r>
+    </w:p>
+    <w:p>
+      <w:r>
         <w:t>袭击；人身攻击</w:t>
       </w:r>
     </w:p>
@@ -957,6 +1222,21 @@
     </w:p>
     <w:p>
       <w:r>
+        <w:t>美式 IPA：/ɪnˈkrɪməˌneɪt/</w:t>
+      </w:r>
+    </w:p>
+    <w:p>
+      <w:r>
+        <w:t>词性：verb</w:t>
+      </w:r>
+    </w:p>
+    <w:p>
+      <w:r>
+        <w:t>English definition: To provide information that makes someone appear involved in a crime.</w:t>
+      </w:r>
+    </w:p>
+    <w:p>
+      <w:r>
         <w:t>使显得有罪；提供不利涉罪证据</w:t>
       </w:r>
     </w:p>
@@ -1001,6 +1281,21 @@
     </w:p>
     <w:p>
       <w:r>
+        <w:t>美式 IPA：/ˌkɑnfəˌdɛnʃiˈæləti/</w:t>
+      </w:r>
+    </w:p>
+    <w:p>
+      <w:r>
+        <w:t>词性：noun</w:t>
+      </w:r>
+    </w:p>
+    <w:p>
+      <w:r>
+        <w:t>English definition: The duty or practice of keeping sensitive information from unauthorized disclosure.</w:t>
+      </w:r>
+    </w:p>
+    <w:p>
+      <w:r>
         <w:t>保密性；保密义务</w:t>
       </w:r>
     </w:p>
@@ -1045,6 +1340,21 @@
     </w:p>
     <w:p>
       <w:r>
+        <w:t>美式 IPA：/rɪˈmɔrs/</w:t>
+      </w:r>
+    </w:p>
+    <w:p>
+      <w:r>
+        <w:t>词性：noun</w:t>
+      </w:r>
+    </w:p>
+    <w:p>
+      <w:r>
+        <w:t>English definition: Deep regret and guilt about harm one has caused.</w:t>
+      </w:r>
+    </w:p>
+    <w:p>
+      <w:r>
         <w:t>懊悔；对过错的内疚</w:t>
       </w:r>
     </w:p>
@@ -1089,6 +1399,21 @@
     </w:p>
     <w:p>
       <w:r>
+        <w:t>美式 IPA：/ɪmˈbɛzəl/</w:t>
+      </w:r>
+    </w:p>
+    <w:p>
+      <w:r>
+        <w:t>词性：verb</w:t>
+      </w:r>
+    </w:p>
+    <w:p>
+      <w:r>
+        <w:t>English definition: To dishonestly take money or property that one was trusted to manage.</w:t>
+      </w:r>
+    </w:p>
+    <w:p>
+      <w:r>
         <w:t>侵吞受托管理的钱财</w:t>
       </w:r>
     </w:p>
@@ -1133,6 +1458,16 @@
     </w:p>
     <w:p>
       <w:r>
+        <w:t>词性：idiom</w:t>
+      </w:r>
+    </w:p>
+    <w:p>
+      <w:r>
+        <w:t>English definition: Freed from responsibility or trouble; with ring, describing a phone ringing repeatedly.</w:t>
+      </w:r>
+    </w:p>
+    <w:p>
+      <w:r>
         <w:t>摆脱责任或困境；电话响个不停</w:t>
       </w:r>
     </w:p>
@@ -1177,6 +1512,16 @@
     </w:p>
     <w:p>
       <w:r>
+        <w:t>词性：noun phrase</w:t>
+      </w:r>
+    </w:p>
+    <w:p>
+      <w:r>
+        <w:t>English definition: A legal protection for certain confidential communications between a lawyer and client made for legal advice.</w:t>
+      </w:r>
+    </w:p>
+    <w:p>
+      <w:r>
         <w:t>律师与委托人之间的保密沟通特权</w:t>
       </w:r>
     </w:p>
@@ -1221,6 +1566,16 @@
     </w:p>
     <w:p>
       <w:r>
+        <w:t>词性：adverb phrase / idiom</w:t>
+      </w:r>
+    </w:p>
+    <w:p>
+      <w:r>
+        <w:t>English definition: In a situation where clear evidence establishes someone's wrongdoing.</w:t>
+      </w:r>
+    </w:p>
+    <w:p>
+      <w:r>
         <w:t>有确凿把柄；当场被抓</w:t>
       </w:r>
     </w:p>
@@ -1265,6 +1620,16 @@
     </w:p>
     <w:p>
       <w:r>
+        <w:t>词性：adverb phrase</w:t>
+      </w:r>
+    </w:p>
+    <w:p>
+      <w:r>
+        <w:t>English definition: Released before trial on a personal promise to return to court, without posting bail money.</w:t>
+      </w:r>
+    </w:p>
+    <w:p>
+      <w:r>
         <w:t>以个人保证获释，无须交保释金</w:t>
       </w:r>
     </w:p>
@@ -1309,6 +1674,16 @@
     </w:p>
     <w:p>
       <w:r>
+        <w:t>词性：noun phrase</w:t>
+      </w:r>
+    </w:p>
+    <w:p>
+      <w:r>
+        <w:t>English definition: Time already spent in custody that counts toward a sentence, or a sentence limited to that time.</w:t>
+      </w:r>
+    </w:p>
+    <w:p>
+      <w:r>
         <w:t>已服刑的时间；以已羁押时间抵刑</w:t>
       </w:r>
     </w:p>
@@ -1427,6 +1802,21 @@
     </w:p>
     <w:p>
       <w:r>
+        <w:t>美式 IPA：/rɪˈteɪnɚ/</w:t>
+      </w:r>
+    </w:p>
+    <w:p>
+      <w:r>
+        <w:t>词性：noun</w:t>
+      </w:r>
+    </w:p>
+    <w:p>
+      <w:r>
+        <w:t>English definition: A fee or arrangement securing a professional's services or availability, especially a lawyer's.</w:t>
+      </w:r>
+    </w:p>
+    <w:p>
+      <w:r>
         <w:t>聘用律师等专业人士的预付费用；聘用安排</w:t>
       </w:r>
     </w:p>
@@ -1471,6 +1861,21 @@
     </w:p>
     <w:p>
       <w:r>
+        <w:t>美式 IPA：/braɪb/</w:t>
+      </w:r>
+    </w:p>
+    <w:p>
+      <w:r>
+        <w:t>词性：noun / verb</w:t>
+      </w:r>
+    </w:p>
+    <w:p>
+      <w:r>
+        <w:t>English definition: Something offered to improperly influence a decision; to offer such an inducement.</w:t>
+      </w:r>
+    </w:p>
+    <w:p>
+      <w:r>
         <w:t>贿赂；贿赂物；行贿</w:t>
       </w:r>
     </w:p>
@@ -1515,6 +1920,21 @@
     </w:p>
     <w:p>
       <w:r>
+        <w:t>美式 IPA：/ɪnˈdʒʌŋkʃən/</w:t>
+      </w:r>
+    </w:p>
+    <w:p>
+      <w:r>
+        <w:t>词性：noun</w:t>
+      </w:r>
+    </w:p>
+    <w:p>
+      <w:r>
+        <w:t>English definition: A court order requiring someone to do or stop doing a specified act.</w:t>
+      </w:r>
+    </w:p>
+    <w:p>
+      <w:r>
         <w:t>法院禁令</w:t>
       </w:r>
     </w:p>
@@ -1559,6 +1979,21 @@
     </w:p>
     <w:p>
       <w:r>
+        <w:t>美式 IPA：/ɪnˈfrɪndʒmənt/</w:t>
+      </w:r>
+    </w:p>
+    <w:p>
+      <w:r>
+        <w:t>词性：noun</w:t>
+      </w:r>
+    </w:p>
+    <w:p>
+      <w:r>
+        <w:t>English definition: An unauthorized interference with a right, especially an intellectual property right.</w:t>
+      </w:r>
+    </w:p>
+    <w:p>
+      <w:r>
         <w:t>侵权；侵犯</w:t>
       </w:r>
     </w:p>
@@ -1603,6 +2038,21 @@
     </w:p>
     <w:p>
       <w:r>
+        <w:t>美式 IPA：/ˈprɛdəˌtɔri/</w:t>
+      </w:r>
+    </w:p>
+    <w:p>
+      <w:r>
+        <w:t>词性：adjective</w:t>
+      </w:r>
+    </w:p>
+    <w:p>
+      <w:r>
+        <w:t>English definition: Seeking an advantage by exploiting people who are vulnerable.</w:t>
+      </w:r>
+    </w:p>
+    <w:p>
+      <w:r>
         <w:t>掠夺性的；专门利用弱者的</w:t>
       </w:r>
     </w:p>
@@ -1647,6 +2097,16 @@
     </w:p>
     <w:p>
       <w:r>
+        <w:t>词性：noun phrase</w:t>
+      </w:r>
+    </w:p>
+    <w:p>
+      <w:r>
+        <w:t>English definition: A publicly funded lawyer who represents eligible defendants unable to afford counsel.</w:t>
+      </w:r>
+    </w:p>
+    <w:p>
+      <w:r>
         <w:t>公设辩护律师</w:t>
       </w:r>
     </w:p>
@@ -1691,6 +2151,16 @@
     </w:p>
     <w:p>
       <w:r>
+        <w:t>词性：noun phrase</w:t>
+      </w:r>
+    </w:p>
+    <w:p>
+      <w:r>
+        <w:t>English definition: A reasonable basis, grounded in facts, for believing a crime occurred or evidence will be found.</w:t>
+      </w:r>
+    </w:p>
+    <w:p>
+      <w:r>
         <w:t>相当理由；合理根据</w:t>
       </w:r>
     </w:p>
@@ -1735,6 +2205,16 @@
     </w:p>
     <w:p>
       <w:r>
+        <w:t>词性：verb phrase</w:t>
+      </w:r>
+    </w:p>
+    <w:p>
+      <w:r>
+        <w:t>English definition: To stop an activity and refrain from starting it again.</w:t>
+      </w:r>
+    </w:p>
+    <w:p>
+      <w:r>
         <w:t>停止并不得继续某种行为</w:t>
       </w:r>
     </w:p>
@@ -1779,6 +2259,16 @@
     </w:p>
     <w:p>
       <w:r>
+        <w:t>词性：noun phrase</w:t>
+      </w:r>
+    </w:p>
+    <w:p>
+      <w:r>
+        <w:t>English definition: A person who voluntarily helps someone in difficulty, especially a stranger.</w:t>
+      </w:r>
+    </w:p>
+    <w:p>
+      <w:r>
         <w:t>善意帮助陌生人的人</w:t>
       </w:r>
     </w:p>
@@ -1897,6 +2387,21 @@
     </w:p>
     <w:p>
       <w:r>
+        <w:t>美式 IPA：/rɪˈteɪnɚ/</w:t>
+      </w:r>
+    </w:p>
+    <w:p>
+      <w:r>
+        <w:t>词性：noun</w:t>
+      </w:r>
+    </w:p>
+    <w:p>
+      <w:r>
+        <w:t>English definition: A fee or arrangement securing a professional's services or availability, especially a lawyer's.</w:t>
+      </w:r>
+    </w:p>
+    <w:p>
+      <w:r>
         <w:t>聘用律师等专业人士的预付费用；聘用安排</w:t>
       </w:r>
     </w:p>
@@ -1941,6 +2446,21 @@
     </w:p>
     <w:p>
       <w:r>
+        <w:t>美式 IPA：/ˈsɑvrən/</w:t>
+      </w:r>
+    </w:p>
+    <w:p>
+      <w:r>
+        <w:t>词性：adjective / noun</w:t>
+      </w:r>
+    </w:p>
+    <w:p>
+      <w:r>
+        <w:t>English definition: Having independent supreme authority; as a noun, a ruler or independent state.</w:t>
+      </w:r>
+    </w:p>
+    <w:p>
+      <w:r>
         <w:t>享有主权的；最高统治者</w:t>
       </w:r>
     </w:p>
@@ -1985,6 +2505,21 @@
     </w:p>
     <w:p>
       <w:r>
+        <w:t>美式 IPA：/ˌɪnkoʊˈhɪrənt/</w:t>
+      </w:r>
+    </w:p>
+    <w:p>
+      <w:r>
+        <w:t>词性：adjective</w:t>
+      </w:r>
+    </w:p>
+    <w:p>
+      <w:r>
+        <w:t>English definition: Difficult to understand because ideas or speech are not logically connected.</w:t>
+      </w:r>
+    </w:p>
+    <w:p>
+      <w:r>
         <w:t>语无伦次的；缺乏逻辑的</w:t>
       </w:r>
     </w:p>
@@ -2029,6 +2564,21 @@
     </w:p>
     <w:p>
       <w:r>
+        <w:t>美式 IPA：/dɪˈluʒən/</w:t>
+      </w:r>
+    </w:p>
+    <w:p>
+      <w:r>
+        <w:t>词性：noun</w:t>
+      </w:r>
+    </w:p>
+    <w:p>
+      <w:r>
+        <w:t>English definition: A strongly held belief that does not match reality.</w:t>
+      </w:r>
+    </w:p>
+    <w:p>
+      <w:r>
         <w:t>妄想；错误而顽固的信念</w:t>
       </w:r>
     </w:p>
@@ -2073,6 +2623,21 @@
     </w:p>
     <w:p>
       <w:r>
+        <w:t>美式 IPA：/əˈmɛndmənt/</w:t>
+      </w:r>
+    </w:p>
+    <w:p>
+      <w:r>
+        <w:t>词性：noun</w:t>
+      </w:r>
+    </w:p>
+    <w:p>
+      <w:r>
+        <w:t>English definition: A formal change or addition to a document, agreement, or law.</w:t>
+      </w:r>
+    </w:p>
+    <w:p>
+      <w:r>
         <w:t>修正案；修订</w:t>
       </w:r>
     </w:p>
@@ -2117,6 +2682,21 @@
     </w:p>
     <w:p>
       <w:r>
+        <w:t>美式 IPA：/koʊˈɝsɪv/</w:t>
+      </w:r>
+    </w:p>
+    <w:p>
+      <w:r>
+        <w:t>词性：adjective</w:t>
+      </w:r>
+    </w:p>
+    <w:p>
+      <w:r>
+        <w:t>English definition: Using threats, force, or pressure to obtain compliance.</w:t>
+      </w:r>
+    </w:p>
+    <w:p>
+      <w:r>
         <w:t>强迫性的；带胁迫性质的</w:t>
       </w:r>
     </w:p>
@@ -2161,6 +2741,16 @@
     </w:p>
     <w:p>
       <w:r>
+        <w:t>词性：adjective / adverb phrase</w:t>
+      </w:r>
+    </w:p>
+    <w:p>
+      <w:r>
+        <w:t>English definition: Employed under an arrangement that secures a professional's services or availability in advance.</w:t>
+      </w:r>
+    </w:p>
+    <w:p>
+      <w:r>
         <w:t>以预付顾问费方式受聘</w:t>
       </w:r>
     </w:p>
@@ -2279,6 +2869,21 @@
     </w:p>
     <w:p>
       <w:r>
+        <w:t>美式 IPA：/əˈsɔlt/</w:t>
+      </w:r>
+    </w:p>
+    <w:p>
+      <w:r>
+        <w:t>词性：noun / verb</w:t>
+      </w:r>
+    </w:p>
+    <w:p>
+      <w:r>
+        <w:t>English definition: A physical attack or, in some legal uses, conduct that creates fear of imminent harm; to attack.</w:t>
+      </w:r>
+    </w:p>
+    <w:p>
+      <w:r>
         <w:t>袭击；人身攻击</w:t>
       </w:r>
     </w:p>
@@ -2323,6 +2928,21 @@
     </w:p>
     <w:p>
       <w:r>
+        <w:t>美式 IPA：/ˈkɪkˌbæk/</w:t>
+      </w:r>
+    </w:p>
+    <w:p>
+      <w:r>
+        <w:t>词性：noun</w:t>
+      </w:r>
+    </w:p>
+    <w:p>
+      <w:r>
+        <w:t>English definition: A secret or improper payment given in return for steering business or granting a favor.</w:t>
+      </w:r>
+    </w:p>
+    <w:p>
+      <w:r>
         <w:t>回扣；非法返利</w:t>
       </w:r>
     </w:p>
@@ -2367,6 +2987,21 @@
     </w:p>
     <w:p>
       <w:r>
+        <w:t>美式 IPA：/əbˈstrʌkʃən/</w:t>
+      </w:r>
+    </w:p>
+    <w:p>
+      <w:r>
+        <w:t>词性：noun</w:t>
+      </w:r>
+    </w:p>
+    <w:p>
+      <w:r>
+        <w:t>English definition: Something that blocks progress; also the act of deliberately interfering with a process.</w:t>
+      </w:r>
+    </w:p>
+    <w:p>
+      <w:r>
         <w:t>阻碍；妨碍</w:t>
       </w:r>
     </w:p>
@@ -2411,6 +3046,16 @@
     </w:p>
     <w:p>
       <w:r>
+        <w:t>词性：adjective / adverb phrase</w:t>
+      </w:r>
+    </w:p>
+    <w:p>
+      <w:r>
+        <w:t>English definition: Honest, open, and conducted according to accepted rules.</w:t>
+      </w:r>
+    </w:p>
+    <w:p>
+      <w:r>
         <w:t>公开、诚实、合规的</w:t>
       </w:r>
     </w:p>
@@ -2455,6 +3100,16 @@
     </w:p>
     <w:p>
       <w:r>
+        <w:t>词性：adjective / adverb phrase</w:t>
+      </w:r>
+    </w:p>
+    <w:p>
+      <w:r>
+        <w:t>English definition: In a position of excessive admiration, as if someone were beyond criticism.</w:t>
+      </w:r>
+    </w:p>
+    <w:p>
+      <w:r>
         <w:t>被过度崇拜的位置</w:t>
       </w:r>
     </w:p>
@@ -2499,6 +3154,16 @@
     </w:p>
     <w:p>
       <w:r>
+        <w:t>词性：adjective / adverb phrase</w:t>
+      </w:r>
+    </w:p>
+    <w:p>
+      <w:r>
+        <w:t>English definition: Beyond control; with reject or dismiss, without serious consideration.</w:t>
+      </w:r>
+    </w:p>
+    <w:p>
+      <w:r>
         <w:t>失去控制；不加考虑地</w:t>
       </w:r>
     </w:p>
@@ -2543,6 +3208,16 @@
     </w:p>
     <w:p>
       <w:r>
+        <w:t>词性：noun phrase / idiom</w:t>
+      </w:r>
+    </w:p>
+    <w:p>
+      <w:r>
+        <w:t>English definition: A desperate final attempt with little chance of success.</w:t>
+      </w:r>
+    </w:p>
+    <w:p>
+      <w:r>
         <w:t>胜算很低的最后一搏</w:t>
       </w:r>
     </w:p>
@@ -2587,6 +3262,21 @@
     </w:p>
     <w:p>
       <w:r>
+        <w:t>美式 IPA：/ˈæmˌbʊʃ/</w:t>
+      </w:r>
+    </w:p>
+    <w:p>
+      <w:r>
+        <w:t>词性：noun / verb</w:t>
+      </w:r>
+    </w:p>
+    <w:p>
+      <w:r>
+        <w:t>English definition: A surprise attack from a concealed position; to attack someone in this way.</w:t>
+      </w:r>
+    </w:p>
+    <w:p>
+      <w:r>
         <w:t>伏击；设伏袭击</w:t>
       </w:r>
     </w:p>
@@ -2705,6 +3395,21 @@
     </w:p>
     <w:p>
       <w:r>
+        <w:t>美式 IPA：/ɪmˈbɛzəlmənt/</w:t>
+      </w:r>
+    </w:p>
+    <w:p>
+      <w:r>
+        <w:t>词性：noun</w:t>
+      </w:r>
+    </w:p>
+    <w:p>
+      <w:r>
+        <w:t>English definition: The dishonest taking of money or property entrusted to one's care.</w:t>
+      </w:r>
+    </w:p>
+    <w:p>
+      <w:r>
         <w:t>侵占；挪用受托管理的财产</w:t>
       </w:r>
     </w:p>
@@ -2749,6 +3454,21 @@
     </w:p>
     <w:p>
       <w:r>
+        <w:t>美式 IPA：/rɪˈteɪnɚ/</w:t>
+      </w:r>
+    </w:p>
+    <w:p>
+      <w:r>
+        <w:t>词性：noun</w:t>
+      </w:r>
+    </w:p>
+    <w:p>
+      <w:r>
+        <w:t>English definition: A fee or arrangement securing a professional's services or availability, especially a lawyer's.</w:t>
+      </w:r>
+    </w:p>
+    <w:p>
+      <w:r>
         <w:t>聘用律师等专业人士的预付费用；聘用安排</w:t>
       </w:r>
     </w:p>
@@ -2793,6 +3513,21 @@
     </w:p>
     <w:p>
       <w:r>
+        <w:t>美式 IPA：/ˌprɑsəˈkjuʃən/</w:t>
+      </w:r>
+    </w:p>
+    <w:p>
+      <w:r>
+        <w:t>词性：noun</w:t>
+      </w:r>
+    </w:p>
+    <w:p>
+      <w:r>
+        <w:t>English definition: The pursuit of criminal charges in court; also the lawyers bringing those charges.</w:t>
+      </w:r>
+    </w:p>
+    <w:p>
+      <w:r>
         <w:t>控方；起诉；检控</w:t>
       </w:r>
     </w:p>
@@ -2837,6 +3572,21 @@
     </w:p>
     <w:p>
       <w:r>
+        <w:t>美式 IPA：/braɪb/</w:t>
+      </w:r>
+    </w:p>
+    <w:p>
+      <w:r>
+        <w:t>词性：noun / verb</w:t>
+      </w:r>
+    </w:p>
+    <w:p>
+      <w:r>
+        <w:t>English definition: Something offered to improperly influence a decision; to offer such an inducement.</w:t>
+      </w:r>
+    </w:p>
+    <w:p>
+      <w:r>
         <w:t>贿赂；贿赂物；行贿</w:t>
       </w:r>
     </w:p>
@@ -2881,6 +3631,21 @@
     </w:p>
     <w:p>
       <w:r>
+        <w:t>美式 IPA：/ɪˈmjunəti/</w:t>
+      </w:r>
+    </w:p>
+    <w:p>
+      <w:r>
+        <w:t>词性：noun</w:t>
+      </w:r>
+    </w:p>
+    <w:p>
+      <w:r>
+        <w:t>English definition: Protection from prosecution or liability in a legal setting; also resistance to disease.</w:t>
+      </w:r>
+    </w:p>
+    <w:p>
+      <w:r>
         <w:t>免疫；法律追诉豁免</w:t>
       </w:r>
     </w:p>
@@ -2925,6 +3690,21 @@
     </w:p>
     <w:p>
       <w:r>
+        <w:t>美式 IPA：/ˈɪmplɪˌkeɪt/</w:t>
+      </w:r>
+    </w:p>
+    <w:p>
+      <w:r>
+        <w:t>词性：verb</w:t>
+      </w:r>
+    </w:p>
+    <w:p>
+      <w:r>
+        <w:t>English definition: To connect someone to wrongdoing or suggest that they were involved.</w:t>
+      </w:r>
+    </w:p>
+    <w:p>
+      <w:r>
         <w:t>牵连；暗示某人涉案</w:t>
       </w:r>
     </w:p>
@@ -2969,6 +3749,21 @@
     </w:p>
     <w:p>
       <w:r>
+        <w:t>美式 IPA：/ɪɡˈzɑnəˌreɪt/</w:t>
+      </w:r>
+    </w:p>
+    <w:p>
+      <w:r>
+        <w:t>词性：verb</w:t>
+      </w:r>
+    </w:p>
+    <w:p>
+      <w:r>
+        <w:t>English definition: To clear someone of blame, responsibility, or an accusation.</w:t>
+      </w:r>
+    </w:p>
+    <w:p>
+      <w:r>
         <w:t>洗清嫌疑；免除责任</w:t>
       </w:r>
     </w:p>
@@ -3013,6 +3808,21 @@
     </w:p>
     <w:p>
       <w:r>
+        <w:t>美式 IPA：/ˈɛkstrəˌdaɪt/</w:t>
+      </w:r>
+    </w:p>
+    <w:p>
+      <w:r>
+        <w:t>词性：verb</w:t>
+      </w:r>
+    </w:p>
+    <w:p>
+      <w:r>
+        <w:t>English definition: To formally transfer a person to another jurisdiction to face criminal proceedings or punishment.</w:t>
+      </w:r>
+    </w:p>
+    <w:p>
+      <w:r>
         <w:t>引渡</w:t>
       </w:r>
     </w:p>
@@ -3057,6 +3867,16 @@
     </w:p>
     <w:p>
       <w:r>
+        <w:t>词性：idiom</w:t>
+      </w:r>
+    </w:p>
+    <w:p>
+      <w:r>
+        <w:t>English definition: Responsible for a cost or obligation; in a fishing metaphor, caught or drawn in as a target.</w:t>
+      </w:r>
+    </w:p>
+    <w:p>
+      <w:r>
         <w:t>承担责任或费用；目标已上钩</w:t>
       </w:r>
     </w:p>
@@ -3101,6 +3921,16 @@
     </w:p>
     <w:p>
       <w:r>
+        <w:t>词性：verb phrase</w:t>
+      </w:r>
+    </w:p>
+    <w:p>
+      <w:r>
+        <w:t>English definition: To formally admit guilt to a criminal charge in court.</w:t>
+      </w:r>
+    </w:p>
+    <w:p>
+      <w:r>
         <w:t>作有罪答辩；认罪</w:t>
       </w:r>
     </w:p>
@@ -3145,6 +3975,16 @@
     </w:p>
     <w:p>
       <w:r>
+        <w:t>词性：noun phrase / idiom</w:t>
+      </w:r>
+    </w:p>
+    <w:p>
+      <w:r>
+        <w:t>English definition: A fresh start without previous mistakes or obligations counting against someone.</w:t>
+      </w:r>
+    </w:p>
+    <w:p>
+      <w:r>
         <w:t>不受旧问题拖累的新起点</w:t>
       </w:r>
     </w:p>
@@ -3263,6 +4103,21 @@
     </w:p>
     <w:p>
       <w:r>
+        <w:t>美式 IPA：/dɪˈskʌvɚi/</w:t>
+      </w:r>
+    </w:p>
+    <w:p>
+      <w:r>
+        <w:t>词性：noun</w:t>
+      </w:r>
+    </w:p>
+    <w:p>
+      <w:r>
+        <w:t>English definition: Finding something previously unknown; in litigation, the process of obtaining and exchanging case information.</w:t>
+      </w:r>
+    </w:p>
+    <w:p>
+      <w:r>
         <w:t>发现；诉讼中的证据开示</w:t>
       </w:r>
     </w:p>
@@ -3307,6 +4162,26 @@
     </w:p>
     <w:p>
       <w:r>
+        <w:t>美式 IPA：/ˈdæmɪdʒɪz/</w:t>
+      </w:r>
+    </w:p>
+    <w:p>
+      <w:r>
+        <w:t>词性：plural noun</w:t>
+      </w:r>
+    </w:p>
+    <w:p>
+      <w:r>
+        <w:t>English definition: Money awarded to compensate for a legally recognized injury or loss.</w:t>
+      </w:r>
+    </w:p>
+    <w:p>
+      <w:r>
+        <w:t>原形：damage</w:t>
+      </w:r>
+    </w:p>
+    <w:p>
+      <w:r>
         <w:t>损害赔偿金</w:t>
       </w:r>
     </w:p>
@@ -3351,6 +4226,21 @@
     </w:p>
     <w:p>
       <w:r>
+        <w:t>美式 IPA：/frɔd/</w:t>
+      </w:r>
+    </w:p>
+    <w:p>
+      <w:r>
+        <w:t>词性：noun</w:t>
+      </w:r>
+    </w:p>
+    <w:p>
+      <w:r>
+        <w:t>English definition: Deliberate deception intended to obtain a benefit or cause another person's loss.</w:t>
+      </w:r>
+    </w:p>
+    <w:p>
+      <w:r>
         <w:t>欺诈</w:t>
       </w:r>
     </w:p>
@@ -3395,6 +4285,21 @@
     </w:p>
     <w:p>
       <w:r>
+        <w:t>美式 IPA：/səˌlɪsɪˈteɪʃən/</w:t>
+      </w:r>
+    </w:p>
+    <w:p>
+      <w:r>
+        <w:t>词性：noun</w:t>
+      </w:r>
+    </w:p>
+    <w:p>
+      <w:r>
+        <w:t>English definition: The act of requesting business, money, or action; in some legal contexts, urging someone to commit an offense.</w:t>
+      </w:r>
+    </w:p>
+    <w:p>
+      <w:r>
         <w:t>招揽；请求；教唆或邀约</w:t>
       </w:r>
     </w:p>
@@ -3439,6 +4344,21 @@
     </w:p>
     <w:p>
       <w:r>
+        <w:t>美式 IPA：/ˌspoʊliˈeɪʃən/</w:t>
+      </w:r>
+    </w:p>
+    <w:p>
+      <w:r>
+        <w:t>词性：noun</w:t>
+      </w:r>
+    </w:p>
+    <w:p>
+      <w:r>
+        <w:t>English definition: The destruction, alteration, or improper loss of evidence relevant to a legal dispute.</w:t>
+      </w:r>
+    </w:p>
+    <w:p>
+      <w:r>
         <w:t>证据毁损、灭失或隐匿</w:t>
       </w:r>
     </w:p>
@@ -3483,6 +4403,21 @@
     </w:p>
     <w:p>
       <w:r>
+        <w:t>美式 IPA：/ˌlɪtəˈɡeɪʃən/</w:t>
+      </w:r>
+    </w:p>
+    <w:p>
+      <w:r>
+        <w:t>词性：noun</w:t>
+      </w:r>
+    </w:p>
+    <w:p>
+      <w:r>
+        <w:t>English definition: The process of pursuing or defending a dispute through the courts.</w:t>
+      </w:r>
+    </w:p>
+    <w:p>
+      <w:r>
         <w:t>诉讼；进行诉讼的过程</w:t>
       </w:r>
     </w:p>
@@ -3527,6 +4462,21 @@
     </w:p>
     <w:p>
       <w:r>
+        <w:t>美式 IPA：/dɪˈfrɔd/</w:t>
+      </w:r>
+    </w:p>
+    <w:p>
+      <w:r>
+        <w:t>词性：verb</w:t>
+      </w:r>
+    </w:p>
+    <w:p>
+      <w:r>
+        <w:t>English definition: To obtain money, property, or another benefit from someone through deception.</w:t>
+      </w:r>
+    </w:p>
+    <w:p>
+      <w:r>
         <w:t>欺诈以骗取钱财或权利</w:t>
       </w:r>
     </w:p>
@@ -3571,6 +4521,21 @@
     </w:p>
     <w:p>
       <w:r>
+        <w:t>美式 IPA：/ˈstætʃut/</w:t>
+      </w:r>
+    </w:p>
+    <w:p>
+      <w:r>
+        <w:t>词性：noun</w:t>
+      </w:r>
+    </w:p>
+    <w:p>
+      <w:r>
+        <w:t>English definition: A written law enacted by a legislative body.</w:t>
+      </w:r>
+    </w:p>
+    <w:p>
+      <w:r>
         <w:t>成文法；法令</w:t>
       </w:r>
     </w:p>
@@ -3615,6 +4580,21 @@
     </w:p>
     <w:p>
       <w:r>
+        <w:t>美式 IPA：/ˈprɛsɪdənt/</w:t>
+      </w:r>
+    </w:p>
+    <w:p>
+      <w:r>
+        <w:t>词性：noun</w:t>
+      </w:r>
+    </w:p>
+    <w:p>
+      <w:r>
+        <w:t>English definition: An earlier decision or event used as a guide for later similar situations.</w:t>
+      </w:r>
+    </w:p>
+    <w:p>
+      <w:r>
         <w:t>先例；具有参考或约束意义的判例</w:t>
       </w:r>
     </w:p>
@@ -3659,6 +4639,21 @@
     </w:p>
     <w:p>
       <w:r>
+        <w:t>美式 IPA：/ˈsæŋkʃən/</w:t>
+      </w:r>
+    </w:p>
+    <w:p>
+      <w:r>
+        <w:t>词性：noun / verb</w:t>
+      </w:r>
+    </w:p>
+    <w:p>
+      <w:r>
+        <w:t>English definition: An official penalty or approval; as a verb, to penalize or formally authorize, depending on context.</w:t>
+      </w:r>
+    </w:p>
+    <w:p>
+      <w:r>
         <w:t>处罚；正式批准</w:t>
       </w:r>
     </w:p>
@@ -3703,6 +4698,21 @@
     </w:p>
     <w:p>
       <w:r>
+        <w:t>美式 IPA：/ˌɛvɪˈdɛnʃiˌɛri/</w:t>
+      </w:r>
+    </w:p>
+    <w:p>
+      <w:r>
+        <w:t>词性：adjective</w:t>
+      </w:r>
+    </w:p>
+    <w:p>
+      <w:r>
+        <w:t>English definition: Relating to evidence or the rules governing its use.</w:t>
+      </w:r>
+    </w:p>
+    <w:p>
+      <w:r>
         <w:t>证据方面的</w:t>
       </w:r>
     </w:p>
@@ -3747,6 +4757,21 @@
     </w:p>
     <w:p>
       <w:r>
+        <w:t>美式 IPA：/ˌmælˈfizəns/</w:t>
+      </w:r>
+    </w:p>
+    <w:p>
+      <w:r>
+        <w:t>词性：noun</w:t>
+      </w:r>
+    </w:p>
+    <w:p>
+      <w:r>
+        <w:t>English definition: Unlawful or seriously improper conduct, especially by someone holding a position of responsibility.</w:t>
+      </w:r>
+    </w:p>
+    <w:p>
+      <w:r>
         <w:t>违法失职；不法行为</w:t>
       </w:r>
     </w:p>
@@ -3791,6 +4816,16 @@
     </w:p>
     <w:p>
       <w:r>
+        <w:t>词性：noun phrase / idiom</w:t>
+      </w:r>
+    </w:p>
+    <w:p>
+      <w:r>
+        <w:t>English definition: A piece of evidence that strongly and directly reveals wrongdoing.</w:t>
+      </w:r>
+    </w:p>
+    <w:p>
+      <w:r>
         <w:t>确凿的关键证据</w:t>
       </w:r>
     </w:p>
@@ -3835,6 +4870,16 @@
     </w:p>
     <w:p>
       <w:r>
+        <w:t>词性：noun phrase</w:t>
+      </w:r>
+    </w:p>
+    <w:p>
+      <w:r>
+        <w:t>English definition: A decision made without a trial when no genuine dispute of material fact requires one and the law determines the outcome.</w:t>
+      </w:r>
+    </w:p>
+    <w:p>
+      <w:r>
         <w:t>简易判决；无需完整审判作出的判决</w:t>
       </w:r>
     </w:p>
@@ -3953,6 +4998,21 @@
     </w:p>
     <w:p>
       <w:r>
+        <w:t>美式 IPA：/ˈsɛtəlmənt/</w:t>
+      </w:r>
+    </w:p>
+    <w:p>
+      <w:r>
+        <w:t>词性：noun</w:t>
+      </w:r>
+    </w:p>
+    <w:p>
+      <w:r>
+        <w:t>English definition: An agreement resolving a dispute, or the money paid under that agreement.</w:t>
+      </w:r>
+    </w:p>
+    <w:p>
+      <w:r>
         <w:t>和解；和解协议或款项</w:t>
       </w:r>
     </w:p>
@@ -3997,6 +5057,21 @@
     </w:p>
     <w:p>
       <w:r>
+        <w:t>美式 IPA：/frɔd/</w:t>
+      </w:r>
+    </w:p>
+    <w:p>
+      <w:r>
+        <w:t>词性：noun</w:t>
+      </w:r>
+    </w:p>
+    <w:p>
+      <w:r>
+        <w:t>English definition: Deliberate deception intended to obtain a benefit or cause another person's loss.</w:t>
+      </w:r>
+    </w:p>
+    <w:p>
+      <w:r>
         <w:t>欺诈</w:t>
       </w:r>
     </w:p>
@@ -4041,6 +5116,21 @@
     </w:p>
     <w:p>
       <w:r>
+        <w:t>美式 IPA：/ˌrækəˈtɪrɪŋ/</w:t>
+      </w:r>
+    </w:p>
+    <w:p>
+      <w:r>
+        <w:t>词性：noun</w:t>
+      </w:r>
+    </w:p>
+    <w:p>
+      <w:r>
+        <w:t>English definition: Carrying out an organized pattern of illegal activity to obtain money or power.</w:t>
+      </w:r>
+    </w:p>
+    <w:p>
+      <w:r>
         <w:t>有组织的非法牟利活动</w:t>
       </w:r>
     </w:p>
@@ -4085,6 +5175,21 @@
     </w:p>
     <w:p>
       <w:r>
+        <w:t>美式 IPA：/ˌdɛpəˈzɪʃən/</w:t>
+      </w:r>
+    </w:p>
+    <w:p>
+      <w:r>
+        <w:t>词性：noun</w:t>
+      </w:r>
+    </w:p>
+    <w:p>
+      <w:r>
+        <w:t>English definition: Sworn testimony taken outside the courtroom and recorded for use in a case.</w:t>
+      </w:r>
+    </w:p>
+    <w:p>
+      <w:r>
         <w:t>庭外宣誓证言；取证问询</w:t>
       </w:r>
     </w:p>
@@ -4129,6 +5234,21 @@
     </w:p>
     <w:p>
       <w:r>
+        <w:t>美式 IPA：/ˈprɛsɪdənt/</w:t>
+      </w:r>
+    </w:p>
+    <w:p>
+      <w:r>
+        <w:t>词性：noun</w:t>
+      </w:r>
+    </w:p>
+    <w:p>
+      <w:r>
+        <w:t>English definition: An earlier decision or event used as a guide for later similar situations.</w:t>
+      </w:r>
+    </w:p>
+    <w:p>
+      <w:r>
         <w:t>先例；具有参考或约束意义的判例</w:t>
       </w:r>
     </w:p>
@@ -4173,6 +5293,21 @@
     </w:p>
     <w:p>
       <w:r>
+        <w:t>美式 IPA：/ˈkɑmpənˌseɪt/</w:t>
+      </w:r>
+    </w:p>
+    <w:p>
+      <w:r>
+        <w:t>词性：verb</w:t>
+      </w:r>
+    </w:p>
+    <w:p>
+      <w:r>
+        <w:t>English definition: To provide payment or another benefit for loss, harm, or work; to make up for a disadvantage.</w:t>
+      </w:r>
+    </w:p>
+    <w:p>
+      <w:r>
         <w:t>赔偿；补偿；弥补</w:t>
       </w:r>
     </w:p>
@@ -4217,6 +5352,16 @@
     </w:p>
     <w:p>
       <w:r>
+        <w:t>词性：noun phrase</w:t>
+      </w:r>
+    </w:p>
+    <w:p>
+      <w:r>
+        <w:t>English definition: A lawsuit brought on behalf of a group whose members have similar legal claims.</w:t>
+      </w:r>
+    </w:p>
+    <w:p>
+      <w:r>
         <w:t>集体诉讼</w:t>
       </w:r>
     </w:p>
@@ -4261,6 +5406,16 @@
     </w:p>
     <w:p>
       <w:r>
+        <w:t>词性：noun phrase</w:t>
+      </w:r>
+    </w:p>
+    <w:p>
+      <w:r>
+        <w:t>English definition: A court order restricting specified conduct or contact, often to prevent harm or interference.</w:t>
+      </w:r>
+    </w:p>
+    <w:p>
+      <w:r>
         <w:t>限制令；禁止特定行为的法院命令</w:t>
       </w:r>
     </w:p>
@@ -4379,6 +5534,21 @@
     </w:p>
     <w:p>
       <w:r>
+        <w:t>美式 IPA：/kənˈtɪndʒənt/</w:t>
+      </w:r>
+    </w:p>
+    <w:p>
+      <w:r>
+        <w:t>词性：adjective / noun</w:t>
+      </w:r>
+    </w:p>
+    <w:p>
+      <w:r>
+        <w:t>English definition: Dependent on a condition; as a noun, a group representing a larger organization or community.</w:t>
+      </w:r>
+    </w:p>
+    <w:p>
+      <w:r>
         <w:t>取决于条件的；代表团</w:t>
       </w:r>
     </w:p>
@@ -4423,6 +5593,16 @@
     </w:p>
     <w:p>
       <w:r>
+        <w:t>词性：adverb phrase</w:t>
+      </w:r>
+    </w:p>
+    <w:p>
+      <w:r>
+        <w:t>English definition: While being forced or pressured by threats rather than acting freely.</w:t>
+      </w:r>
+    </w:p>
+    <w:p>
+      <w:r>
         <w:t>在胁迫下</w:t>
       </w:r>
     </w:p>
@@ -4467,6 +5647,21 @@
     </w:p>
     <w:p>
       <w:r>
+        <w:t>美式 IPA：/bɪˈtreɪəl/</w:t>
+      </w:r>
+    </w:p>
+    <w:p>
+      <w:r>
+        <w:t>词性：noun</w:t>
+      </w:r>
+    </w:p>
+    <w:p>
+      <w:r>
+        <w:t>English definition: An act that breaks trust or abandons a person or principle.</w:t>
+      </w:r>
+    </w:p>
+    <w:p>
+      <w:r>
         <w:t>背叛；辜负信任</w:t>
       </w:r>
     </w:p>
@@ -4511,6 +5706,16 @@
     </w:p>
     <w:p>
       <w:r>
+        <w:t>词性：adjective / adverb phrase</w:t>
+      </w:r>
+    </w:p>
+    <w:p>
+      <w:r>
+        <w:t>English definition: Outside normal control or moving in a seriously misguided direction.</w:t>
+      </w:r>
+    </w:p>
+    <w:p>
+      <w:r>
         <w:t>失控；偏离正常轨道</w:t>
       </w:r>
     </w:p>
@@ -4555,6 +5760,21 @@
     </w:p>
     <w:p>
       <w:r>
+        <w:t>美式 IPA：/ˈlaɪvliˌhʊd/</w:t>
+      </w:r>
+    </w:p>
+    <w:p>
+      <w:r>
+        <w:t>词性：noun</w:t>
+      </w:r>
+    </w:p>
+    <w:p>
+      <w:r>
+        <w:t>English definition: The means by which a person earns enough to live.</w:t>
+      </w:r>
+    </w:p>
+    <w:p>
+      <w:r>
         <w:t>生计；谋生方式</w:t>
       </w:r>
     </w:p>
@@ -4599,6 +5819,26 @@
     </w:p>
     <w:p>
       <w:r>
+        <w:t>美式 IPA：/ɪmˈpaʊndɪd/</w:t>
+      </w:r>
+    </w:p>
+    <w:p>
+      <w:r>
+        <w:t>词性：verb (past tense / past participle)</w:t>
+      </w:r>
+    </w:p>
+    <w:p>
+      <w:r>
+        <w:t>English definition: Taken into official custody, often referring to a vehicle seized by authorities.</w:t>
+      </w:r>
+    </w:p>
+    <w:p>
+      <w:r>
+        <w:t>原形：impound</w:t>
+      </w:r>
+    </w:p>
+    <w:p>
+      <w:r>
         <w:t>被依法扣押的</w:t>
       </w:r>
     </w:p>
@@ -4722,6 +5962,36 @@
     <w:p>
       <w:r>
         <w:t>Anki 官方文本导入说明：https://docs.ankiweb.net/manual/importing/text-files</w:t>
+      </w:r>
+    </w:p>
+    <w:p>
+      <w:r>
+        <w:t>CMU Pronouncing Dictionary — 美式发音核对：https://github.com/cmusphinx/cmudict</w:t>
+      </w:r>
+    </w:p>
+    <w:p>
+      <w:r>
+        <w:t>Merriam-Webster — probative 的读音与词性：https://www.merriam-webster.com/dictionary/probative</w:t>
+      </w:r>
+    </w:p>
+    <w:p>
+      <w:r>
+        <w:t>Merriam-Webster — spoliation 的读音与法律义：https://www.merriam-webster.com/dictionary/spoliation</w:t>
+      </w:r>
+    </w:p>
+    <w:p>
+      <w:r>
+        <w:t>Merriam-Webster — hypersensitivity 的重音：https://www.merriam-webster.com/dictionary/hypersensitivity</w:t>
+      </w:r>
+    </w:p>
+    <w:p>
+      <w:r>
+        <w:t>Merriam-Webster — rigmarole 的读音变体：https://www.merriam-webster.com/dictionary/rigmarole</w:t>
+      </w:r>
+    </w:p>
+    <w:p>
+      <w:r>
+        <w:t>美式发音核对参考 CMU Pronouncing Dictionary；许可与致谢：https://chuanwang66.github.io/better-call-saul-english/data/CMUDICT-LICENSE.txt</w:t>
       </w:r>
     </w:p>
     <w:sectPr>

</xml_diff>